<commit_message>
remove ishamai in preparation for making a submodule
</commit_message>
<xml_diff>
--- a/sentences.docx
+++ b/sentences.docx
@@ -10,7 +10,6 @@
           <w:rFonts w:ascii="DejaVu Sans" w:hAnsi="DejaVu Sans"/>
         </w:rPr>
       </w:pPr>
-      <w:bookmarkStart w:id="0" w:name="sentences-typed-by-the-player"/>
       <w:r>
         <w:rPr>
           <w:rFonts w:ascii="DejaVu Sans" w:hAnsi="DejaVu Sans"/>
@@ -293,7 +292,6 @@
           <w:rFonts w:ascii="DejaVu Sans" w:hAnsi="DejaVu Sans"/>
         </w:rPr>
       </w:pPr>
-      <w:bookmarkStart w:id="1" w:name="if-the-player-makes-a-mistake"/>
       <w:r>
         <w:rPr>
           <w:rFonts w:ascii="DejaVu Sans" w:hAnsi="DejaVu Sans"/>
@@ -312,19 +310,7 @@
         <w:rPr>
           <w:rFonts w:ascii="DejaVu Sans" w:hAnsi="DejaVu Sans"/>
         </w:rPr>
-        <w:t xml:space="preserve">All of these are in English. Feel free to skip the whole section. They’re comments from the fictional editor about how the fictional scribe </w:t>
-      </w:r>
-      <w:r>
-        <w:rPr>
-          <w:rFonts w:ascii="DejaVu Sans" w:hAnsi="DejaVu Sans"/>
-        </w:rPr>
-        <w:t>(i.e. the player)</w:t>
-      </w:r>
-      <w:r>
-        <w:rPr>
-          <w:rFonts w:ascii="DejaVu Sans" w:hAnsi="DejaVu Sans"/>
-        </w:rPr>
-        <w:t xml:space="preserve"> got something wrong.</w:t>
+        <w:t>All of these are in English. Feel free to skip the whole section. They’re comments from the fictional editor about how the fictional scribe (i.e. the player) got something wrong.</w:t>
       </w:r>
     </w:p>
     <w:p>
@@ -626,8 +612,8 @@
           <w:rFonts w:ascii="DejaVu Sans" w:hAnsi="DejaVu Sans"/>
         </w:rPr>
       </w:pPr>
-      <w:bookmarkStart w:id="2" w:name="sentences-typed-by-the-player"/>
-      <w:bookmarkStart w:id="3" w:name="if-the-player-makes-a-mistake"/>
+      <w:bookmarkStart w:id="0" w:name="if-the-player-makes-a-mistake"/>
+      <w:bookmarkStart w:id="1" w:name="sentences-typed-by-the-player"/>
       <w:r>
         <w:rPr>
           <w:rFonts w:ascii="DejaVu Sans" w:hAnsi="DejaVu Sans"/>
@@ -636,8 +622,124 @@
         </w:rPr>
         <w:t>This sentence seems to be incomplete. The tablet may be damaged at this point.</w:t>
       </w:r>
+      <w:bookmarkEnd w:id="0"/>
+      <w:bookmarkEnd w:id="1"/>
+    </w:p>
+    <w:p>
+      <w:pPr>
+        <w:pStyle w:val="Heading1"/>
+        <w:rPr>
+          <w:rFonts w:ascii="DejaVu Sans" w:hAnsi="DejaVu Sans"/>
+        </w:rPr>
+      </w:pPr>
+      <w:r>
+        <w:rPr>
+          <w:rFonts w:ascii="DejaVu Sans" w:hAnsi="DejaVu Sans"/>
+        </w:rPr>
+        <w:t>Sentences describing the player’s surroundings</w:t>
+      </w:r>
+    </w:p>
+    <w:p>
+      <w:pPr>
+        <w:pStyle w:val="FirstParagraph"/>
+        <w:rPr>
+          <w:rFonts w:ascii="DejaVu Sans" w:hAnsi="DejaVu Sans"/>
+        </w:rPr>
+      </w:pPr>
+      <w:r>
+        <w:rPr>
+          <w:rFonts w:ascii="DejaVu Sans" w:hAnsi="DejaVu Sans"/>
+        </w:rPr>
+        <w:t>Nu=za LOCATION-DAT PREVERB ešun.</w:t>
+        <w:br/>
+        <w:t>Nu=za=kan LOCATION-DAT PREVERB ešun. (if PREVERB is anda, šēr, or appa)</w:t>
+        <w:br/>
+        <w:t>“I was at LOCATION.”</w:t>
+      </w:r>
+    </w:p>
+    <w:p>
+      <w:pPr>
+        <w:pStyle w:val="BodyText"/>
+        <w:rPr>
+          <w:rFonts w:ascii="DejaVu Sans" w:hAnsi="DejaVu Sans"/>
+        </w:rPr>
+      </w:pPr>
+      <w:r>
+        <w:rPr>
+          <w:rFonts w:ascii="DejaVu Sans" w:hAnsi="DejaVu Sans"/>
+        </w:rPr>
+        <w:t>Nu apiya OBJECTS-ACC ōḫḫun.</w:t>
+        <w:br/>
+        <w:t>“I saw OBJECTS there.”</w:t>
+        <w:br/>
+        <w:t>(ō will appear as u-u° in cuneiform and ū in bound transcription.)</w:t>
+      </w:r>
+    </w:p>
+    <w:p>
+      <w:pPr>
+        <w:pStyle w:val="BodyText"/>
+        <w:rPr>
+          <w:rFonts w:ascii="DejaVu Sans" w:hAnsi="DejaVu Sans"/>
+        </w:rPr>
+      </w:pPr>
+      <w:r>
+        <w:rPr>
+          <w:rFonts w:ascii="DejaVu Sans" w:hAnsi="DejaVu Sans"/>
+        </w:rPr>
+        <w:t>Nu OBJECTS-NOM HOLDER-DAT PREVERB ēšta.</w:t>
+        <w:br/>
+        <w:t>Nu OBJECTS-NOM HOLDER-DAT PREVERB ešer.</w:t>
+        <w:br/>
+        <w:t>“OBJECTS were in/on/at HOLDER.”</w:t>
+      </w:r>
+    </w:p>
+    <w:p>
+      <w:pPr>
+        <w:pStyle w:val="BodyText"/>
+        <w:rPr>
+          <w:rFonts w:ascii="DejaVu Sans" w:hAnsi="DejaVu Sans"/>
+        </w:rPr>
+      </w:pPr>
+      <w:r>
+        <w:rPr>
+          <w:rFonts w:ascii="DejaVu Sans" w:hAnsi="DejaVu Sans"/>
+        </w:rPr>
+        <w:t>Nu OBJECTS-ACC ḫarkun.</w:t>
+        <w:br/>
+        <w:t>“I was holding OBJECTS.”</w:t>
+      </w:r>
+    </w:p>
+    <w:p>
+      <w:pPr>
+        <w:pStyle w:val="BodyText"/>
+        <w:rPr>
+          <w:rFonts w:ascii="DejaVu Sans" w:hAnsi="DejaVu Sans"/>
+        </w:rPr>
+      </w:pPr>
+      <w:r>
+        <w:rPr>
+          <w:rFonts w:ascii="DejaVu Sans" w:hAnsi="DejaVu Sans"/>
+        </w:rPr>
+        <w:t>Nu OBJECTS-ACC waššiyanun.</w:t>
+        <w:br/>
+        <w:t>“I was wearing OBJECTS.”</w:t>
+      </w:r>
+    </w:p>
+    <w:p>
+      <w:pPr>
+        <w:pStyle w:val="BodyText"/>
+        <w:rPr>
+          <w:rFonts w:ascii="DejaVu Sans" w:hAnsi="DejaVu Sans"/>
+        </w:rPr>
+      </w:pPr>
+      <w:bookmarkStart w:id="2" w:name="Xc6478fc0740ba3b53fe0a687f4b616333fcf4f2"/>
+      <w:r>
+        <w:rPr>
+          <w:rFonts w:ascii="DejaVu Sans" w:hAnsi="DejaVu Sans"/>
+        </w:rPr>
+        <w:t>In all of these sentences, multiple objects will be separated by Ù, to avoid the consonant doubling that comes with the native Hittite “and” clitic.</w:t>
+      </w:r>
       <w:bookmarkEnd w:id="2"/>
-      <w:bookmarkEnd w:id="3"/>
     </w:p>
     <w:p>
       <w:pPr>
@@ -646,124 +748,6 @@
           <w:rFonts w:ascii="DejaVu Sans" w:hAnsi="DejaVu Sans"/>
         </w:rPr>
       </w:pPr>
-      <w:bookmarkStart w:id="4" w:name="Xc6478fc0740ba3b53fe0a687f4b616333fcf4f2"/>
-      <w:r>
-        <w:rPr>
-          <w:rFonts w:ascii="DejaVu Sans" w:hAnsi="DejaVu Sans"/>
-        </w:rPr>
-        <w:t>Sentences describing the player’s surroundings</w:t>
-      </w:r>
-    </w:p>
-    <w:p>
-      <w:pPr>
-        <w:pStyle w:val="FirstParagraph"/>
-        <w:rPr>
-          <w:rFonts w:ascii="DejaVu Sans" w:hAnsi="DejaVu Sans"/>
-        </w:rPr>
-      </w:pPr>
-      <w:r>
-        <w:rPr>
-          <w:rFonts w:ascii="DejaVu Sans" w:hAnsi="DejaVu Sans"/>
-        </w:rPr>
-        <w:t>Nu=za LOCATION-DAT PREVERB ešun.</w:t>
-        <w:br/>
-        <w:t>Nu=za=kan LOCATION-DAT PREVERB ešun. (if PREVERB is anda, šēr, or appa)</w:t>
-        <w:br/>
-        <w:t>“I was at LOCATION.”</w:t>
-      </w:r>
-    </w:p>
-    <w:p>
-      <w:pPr>
-        <w:pStyle w:val="BodyText"/>
-        <w:rPr>
-          <w:rFonts w:ascii="DejaVu Sans" w:hAnsi="DejaVu Sans"/>
-        </w:rPr>
-      </w:pPr>
-      <w:r>
-        <w:rPr>
-          <w:rFonts w:ascii="DejaVu Sans" w:hAnsi="DejaVu Sans"/>
-        </w:rPr>
-        <w:t>Nu apiya OBJECTS-ACC ōḫḫun.</w:t>
-        <w:br/>
-        <w:t>“I saw OBJECTS there.”</w:t>
-        <w:br/>
-        <w:t>(ō will appear as u-u° in cuneiform and ū in bound transcription.)</w:t>
-      </w:r>
-    </w:p>
-    <w:p>
-      <w:pPr>
-        <w:pStyle w:val="BodyText"/>
-        <w:rPr>
-          <w:rFonts w:ascii="DejaVu Sans" w:hAnsi="DejaVu Sans"/>
-        </w:rPr>
-      </w:pPr>
-      <w:r>
-        <w:rPr>
-          <w:rFonts w:ascii="DejaVu Sans" w:hAnsi="DejaVu Sans"/>
-        </w:rPr>
-        <w:t>Nu OBJECTS-NOM HOLDER-DAT PREVERB ēšta.</w:t>
-        <w:br/>
-        <w:t>Nu OBJECTS-NOM HOLDER-DAT PREVERB ešer.</w:t>
-        <w:br/>
-        <w:t>“OBJECTS were in/on/at HOLDER.”</w:t>
-      </w:r>
-    </w:p>
-    <w:p>
-      <w:pPr>
-        <w:pStyle w:val="BodyText"/>
-        <w:rPr>
-          <w:rFonts w:ascii="DejaVu Sans" w:hAnsi="DejaVu Sans"/>
-        </w:rPr>
-      </w:pPr>
-      <w:r>
-        <w:rPr>
-          <w:rFonts w:ascii="DejaVu Sans" w:hAnsi="DejaVu Sans"/>
-        </w:rPr>
-        <w:t>Nu OBJECTS-ACC ḫarkun.</w:t>
-        <w:br/>
-        <w:t>“I was holding OBJECTS.”</w:t>
-      </w:r>
-    </w:p>
-    <w:p>
-      <w:pPr>
-        <w:pStyle w:val="BodyText"/>
-        <w:rPr>
-          <w:rFonts w:ascii="DejaVu Sans" w:hAnsi="DejaVu Sans"/>
-        </w:rPr>
-      </w:pPr>
-      <w:r>
-        <w:rPr>
-          <w:rFonts w:ascii="DejaVu Sans" w:hAnsi="DejaVu Sans"/>
-        </w:rPr>
-        <w:t>Nu OBJECTS-ACC waššiyanun.</w:t>
-        <w:br/>
-        <w:t>“I was wearing OBJECTS.”</w:t>
-      </w:r>
-    </w:p>
-    <w:p>
-      <w:pPr>
-        <w:pStyle w:val="BodyText"/>
-        <w:rPr>
-          <w:rFonts w:ascii="DejaVu Sans" w:hAnsi="DejaVu Sans"/>
-        </w:rPr>
-      </w:pPr>
-      <w:bookmarkStart w:id="5" w:name="Xc6478fc0740ba3b53fe0a687f4b616333fcf4f2"/>
-      <w:r>
-        <w:rPr>
-          <w:rFonts w:ascii="DejaVu Sans" w:hAnsi="DejaVu Sans"/>
-        </w:rPr>
-        <w:t>In all of these sentences, multiple objects will be separated by Ù, to avoid the consonant doubling that comes with the native Hittite “and” clitic.</w:t>
-      </w:r>
-      <w:bookmarkEnd w:id="5"/>
-    </w:p>
-    <w:p>
-      <w:pPr>
-        <w:pStyle w:val="Heading1"/>
-        <w:rPr>
-          <w:rFonts w:ascii="DejaVu Sans" w:hAnsi="DejaVu Sans"/>
-        </w:rPr>
-      </w:pPr>
-      <w:bookmarkStart w:id="6" w:name="sentences-describing-basic-actions"/>
       <w:r>
         <w:rPr>
           <w:rFonts w:ascii="DejaVu Sans" w:hAnsi="DejaVu Sans"/>
@@ -778,7 +762,6 @@
           <w:rFonts w:ascii="DejaVu Sans" w:hAnsi="DejaVu Sans"/>
         </w:rPr>
       </w:pPr>
-      <w:bookmarkStart w:id="7" w:name="movement"/>
       <w:r>
         <w:rPr>
           <w:rFonts w:ascii="DejaVu Sans" w:hAnsi="DejaVu Sans"/>
@@ -971,7 +954,7 @@
           <w:rFonts w:ascii="DejaVu Sans" w:hAnsi="DejaVu Sans"/>
         </w:rPr>
       </w:pPr>
-      <w:bookmarkStart w:id="8" w:name="movement"/>
+      <w:bookmarkStart w:id="3" w:name="movement"/>
       <w:r>
         <w:rPr>
           <w:rFonts w:ascii="DejaVu Sans" w:hAnsi="DejaVu Sans"/>
@@ -980,7 +963,7 @@
         <w:br/>
         <w:t>“The door was closed.”</w:t>
       </w:r>
-      <w:bookmarkEnd w:id="8"/>
+      <w:bookmarkEnd w:id="3"/>
     </w:p>
     <w:p>
       <w:pPr>
@@ -989,7 +972,6 @@
           <w:rFonts w:ascii="DejaVu Sans" w:hAnsi="DejaVu Sans"/>
         </w:rPr>
       </w:pPr>
-      <w:bookmarkStart w:id="9" w:name="taking-dropping-putting"/>
       <w:r>
         <w:rPr>
           <w:rFonts w:ascii="DejaVu Sans" w:hAnsi="DejaVu Sans"/>
@@ -1152,23 +1134,267 @@
           <w:i/>
           <w:iCs/>
         </w:rPr>
-        <w:t xml:space="preserve">Spatial relations in Hittite are a complicated topic, and it’s not clear what arrangement the scribe was envisioning between the </w:t>
-      </w:r>
+        <w:t>Spatial relations in Hittite are a complicated topic, and it’s not clear what arrangement the scribe was envisioning between the OBJ-ACC and the HOLDER-DAT. Whatever that arrangement was, it doesn’t seem to have worked.</w:t>
+      </w:r>
+    </w:p>
+    <w:p>
+      <w:pPr>
+        <w:pStyle w:val="BodyText"/>
+        <w:rPr>
+          <w:rFonts w:ascii="DejaVu Sans" w:hAnsi="DejaVu Sans"/>
+        </w:rPr>
+      </w:pPr>
+      <w:r>
+        <w:rPr>
+          <w:rFonts w:ascii="DejaVu Sans" w:hAnsi="DejaVu Sans"/>
+        </w:rPr>
+        <w:t>Tried to put something without specifying a destination (katta or a dative noun):</w:t>
+      </w:r>
+    </w:p>
+    <w:p>
+      <w:pPr>
+        <w:pStyle w:val="BodyText"/>
+        <w:rPr>
+          <w:rFonts w:ascii="DejaVu Sans" w:hAnsi="DejaVu Sans"/>
+        </w:rPr>
+      </w:pPr>
       <w:r>
         <w:rPr>
           <w:rFonts w:ascii="DejaVu Sans" w:hAnsi="DejaVu Sans"/>
           <w:i/>
           <w:iCs/>
         </w:rPr>
-        <w:t>OBJ-ACC</w:t>
-      </w:r>
+        <w:t>This sentence seems to be incomplete. The verb (span @hittite) tēḫḫun should include a destination: either a noun in the dative, or an adverb like (span @hittite) katta “down” ( on the ground ) .</w:t>
+      </w:r>
+    </w:p>
+    <w:p>
+      <w:pPr>
+        <w:pStyle w:val="BodyText"/>
+        <w:rPr>
+          <w:rFonts w:ascii="DejaVu Sans" w:hAnsi="DejaVu Sans"/>
+        </w:rPr>
+      </w:pPr>
+      <w:bookmarkStart w:id="4" w:name="taking-dropping-putting"/>
+      <w:r>
+        <w:rPr>
+          <w:rFonts w:ascii="DejaVu Sans" w:hAnsi="DejaVu Sans"/>
+        </w:rPr>
+        <w:t>Those last two seemed easier to express in English than Hittite, so the fictional editor of these tablets just comments on the sentences being anomalous and moves on.</w:t>
+      </w:r>
+      <w:bookmarkEnd w:id="4"/>
+    </w:p>
+    <w:p>
+      <w:pPr>
+        <w:pStyle w:val="Heading2"/>
+        <w:rPr>
+          <w:rFonts w:ascii="DejaVu Sans" w:hAnsi="DejaVu Sans"/>
+        </w:rPr>
+      </w:pPr>
+      <w:r>
+        <w:rPr>
+          <w:rFonts w:ascii="DejaVu Sans" w:hAnsi="DejaVu Sans"/>
+        </w:rPr>
+        <w:t>Other actions</w:t>
+      </w:r>
+    </w:p>
+    <w:p>
+      <w:pPr>
+        <w:pStyle w:val="FirstParagraph"/>
+        <w:rPr>
+          <w:rFonts w:ascii="DejaVu Sans" w:hAnsi="DejaVu Sans"/>
+        </w:rPr>
+      </w:pPr>
+      <w:r>
+        <w:rPr>
+          <w:rFonts w:ascii="DejaVu Sans" w:hAnsi="DejaVu Sans"/>
+        </w:rPr>
+        <w:t>Tried to slay without =kan:</w:t>
+      </w:r>
+    </w:p>
+    <w:p>
+      <w:pPr>
+        <w:pStyle w:val="BodyText"/>
+        <w:rPr>
+          <w:rFonts w:ascii="DejaVu Sans" w:hAnsi="DejaVu Sans"/>
+        </w:rPr>
+      </w:pPr>
       <w:r>
         <w:rPr>
           <w:rFonts w:ascii="DejaVu Sans" w:hAnsi="DejaVu Sans"/>
           <w:i/>
           <w:iCs/>
         </w:rPr>
-        <w:t xml:space="preserve"> and the </w:t>
+        <w:t>This sentence is likely a scribal error. The verb (span @hittite) kuenun “slay” requires the sentence particle =kan to be attached to the first word of the sentence.</w:t>
+      </w:r>
+    </w:p>
+    <w:p>
+      <w:pPr>
+        <w:pStyle w:val="BodyText"/>
+        <w:rPr>
+          <w:rFonts w:ascii="DejaVu Sans" w:hAnsi="DejaVu Sans"/>
+        </w:rPr>
+      </w:pPr>
+      <w:r>
+        <w:rPr>
+          <w:rFonts w:ascii="DejaVu Sans" w:hAnsi="DejaVu Sans"/>
+        </w:rPr>
+        <w:t>Tried to slay something that is not alive:</w:t>
+      </w:r>
+    </w:p>
+    <w:p>
+      <w:pPr>
+        <w:pStyle w:val="BodyText"/>
+        <w:rPr>
+          <w:rFonts w:ascii="DejaVu Sans" w:hAnsi="DejaVu Sans"/>
+        </w:rPr>
+      </w:pPr>
+      <w:r>
+        <w:rPr>
+          <w:rFonts w:ascii="DejaVu Sans" w:hAnsi="DejaVu Sans"/>
+        </w:rPr>
+        <w:t>N=aš antuḫšaš natta ēšta.</w:t>
+        <w:br/>
+        <w:t>N=at antuḫšaš natta ēšta.</w:t>
+        <w:br/>
+        <w:t>“It was not a person.”</w:t>
+      </w:r>
+    </w:p>
+    <w:p>
+      <w:pPr>
+        <w:pStyle w:val="BodyText"/>
+        <w:rPr>
+          <w:rFonts w:ascii="DejaVu Sans" w:hAnsi="DejaVu Sans"/>
+        </w:rPr>
+      </w:pPr>
+      <w:r>
+        <w:rPr>
+          <w:rFonts w:ascii="DejaVu Sans" w:hAnsi="DejaVu Sans"/>
+        </w:rPr>
+        <w:t>Tried to slay while not holding the specified weapon:</w:t>
+      </w:r>
+    </w:p>
+    <w:p>
+      <w:pPr>
+        <w:pStyle w:val="BodyText"/>
+        <w:rPr>
+          <w:rFonts w:ascii="DejaVu Sans" w:hAnsi="DejaVu Sans"/>
+        </w:rPr>
+      </w:pPr>
+      <w:bookmarkStart w:id="5" w:name="other-actions"/>
+      <w:bookmarkStart w:id="6" w:name="sentences-describing-basic-actions"/>
+      <w:r>
+        <w:rPr>
+          <w:rFonts w:ascii="DejaVu Sans" w:hAnsi="DejaVu Sans"/>
+        </w:rPr>
+        <w:t>Nu WEAPON-ACC natta ḫarkun.</w:t>
+      </w:r>
+      <w:bookmarkEnd w:id="5"/>
+      <w:bookmarkEnd w:id="6"/>
+    </w:p>
+    <w:p>
+      <w:pPr>
+        <w:pStyle w:val="Heading1"/>
+        <w:rPr>
+          <w:rFonts w:ascii="DejaVu Sans" w:hAnsi="DejaVu Sans"/>
+        </w:rPr>
+      </w:pPr>
+      <w:r>
+        <w:rPr>
+          <w:rFonts w:ascii="DejaVu Sans" w:hAnsi="DejaVu Sans"/>
+        </w:rPr>
+        <w:t>Sentences describing specific situations</w:t>
+      </w:r>
+    </w:p>
+    <w:p>
+      <w:pPr>
+        <w:pStyle w:val="FirstParagraph"/>
+        <w:rPr>
+          <w:rFonts w:ascii="DejaVu Sans" w:hAnsi="DejaVu Sans"/>
+        </w:rPr>
+      </w:pPr>
+      <w:r>
+        <w:rPr>
+          <w:rFonts w:ascii="DejaVu Sans" w:hAnsi="DejaVu Sans"/>
+        </w:rPr>
+        <w:t>Filling a vessel with water:</w:t>
+      </w:r>
+    </w:p>
+    <w:p>
+      <w:pPr>
+        <w:pStyle w:val="BodyText"/>
+        <w:rPr>
+          <w:rFonts w:ascii="DejaVu Sans" w:hAnsi="DejaVu Sans"/>
+        </w:rPr>
+      </w:pPr>
+      <w:r>
+        <w:rPr>
+          <w:rFonts w:ascii="DejaVu Sans" w:hAnsi="DejaVu Sans"/>
+        </w:rPr>
+        <w:t>Nu wātar VESSEL-DAT tēḫḫun.</w:t>
+        <w:br/>
+        <w:t>“I put the water in the VESSEL.”</w:t>
+      </w:r>
+    </w:p>
+    <w:p>
+      <w:pPr>
+        <w:pStyle w:val="BodyText"/>
+        <w:rPr>
+          <w:rFonts w:ascii="DejaVu Sans" w:hAnsi="DejaVu Sans"/>
+        </w:rPr>
+      </w:pPr>
+      <w:r>
+        <w:rPr>
+          <w:rFonts w:ascii="DejaVu Sans" w:hAnsi="DejaVu Sans"/>
+        </w:rPr>
+        <w:t>Trying to take water without having a vessel:</w:t>
+      </w:r>
+    </w:p>
+    <w:p>
+      <w:pPr>
+        <w:pStyle w:val="BodyText"/>
+        <w:rPr>
+          <w:rFonts w:ascii="DejaVu Sans" w:hAnsi="DejaVu Sans"/>
+        </w:rPr>
+      </w:pPr>
+      <w:r>
+        <w:rPr>
+          <w:rFonts w:ascii="DejaVu Sans" w:hAnsi="DejaVu Sans"/>
+        </w:rPr>
+        <w:t>Nu wātar natta taruḫḫun ḫarkun.</w:t>
+        <w:br/>
+        <w:t>“I could not hold the water.”</w:t>
+      </w:r>
+    </w:p>
+    <w:p>
+      <w:pPr>
+        <w:pStyle w:val="BodyText"/>
+        <w:rPr>
+          <w:rFonts w:ascii="DejaVu Sans" w:hAnsi="DejaVu Sans"/>
+        </w:rPr>
+      </w:pPr>
+      <w:r>
+        <w:rPr>
+          <w:rFonts w:ascii="DejaVu Sans" w:hAnsi="DejaVu Sans"/>
+        </w:rPr>
+        <w:t>Trying to enter a window that’s out of reach:</w:t>
+      </w:r>
+    </w:p>
+    <w:p>
+      <w:pPr>
+        <w:pStyle w:val="BodyText"/>
+        <w:rPr>
+          <w:rFonts w:ascii="DejaVu Sans" w:hAnsi="DejaVu Sans"/>
+        </w:rPr>
+      </w:pPr>
+      <w:r>
+        <w:rPr>
+          <w:rFonts w:ascii="DejaVu Sans" w:hAnsi="DejaVu Sans"/>
+        </w:rPr>
+        <w:t>N=at parku ēšta.</w:t>
+        <w:br/>
+        <w:t>“It was high up.”</w:t>
+        <w:br/>
+        <w:t xml:space="preserve">(Neuter to agree with </w:t>
       </w:r>
       <w:r>
         <w:rPr>
@@ -1176,284 +1402,6 @@
           <w:i/>
           <w:iCs/>
         </w:rPr>
-        <w:t>HOLDER-DAT</w:t>
-      </w:r>
-      <w:r>
-        <w:rPr>
-          <w:rFonts w:ascii="DejaVu Sans" w:hAnsi="DejaVu Sans"/>
-          <w:i/>
-          <w:iCs/>
-        </w:rPr>
-        <w:t>. Whatever that arrangement was, it doesn’t seem to have worked.</w:t>
-      </w:r>
-    </w:p>
-    <w:p>
-      <w:pPr>
-        <w:pStyle w:val="BodyText"/>
-        <w:rPr>
-          <w:rFonts w:ascii="DejaVu Sans" w:hAnsi="DejaVu Sans"/>
-        </w:rPr>
-      </w:pPr>
-      <w:r>
-        <w:rPr>
-          <w:rFonts w:ascii="DejaVu Sans" w:hAnsi="DejaVu Sans"/>
-        </w:rPr>
-        <w:t>Tried to put something without specifying a destination (katta or a dative noun):</w:t>
-      </w:r>
-    </w:p>
-    <w:p>
-      <w:pPr>
-        <w:pStyle w:val="BodyText"/>
-        <w:rPr>
-          <w:rFonts w:ascii="DejaVu Sans" w:hAnsi="DejaVu Sans"/>
-        </w:rPr>
-      </w:pPr>
-      <w:r>
-        <w:rPr>
-          <w:rFonts w:ascii="DejaVu Sans" w:hAnsi="DejaVu Sans"/>
-          <w:i/>
-          <w:iCs/>
-        </w:rPr>
-        <w:t>This sentence seems to be incomplete. The verb (span @hittite) tēḫḫun should include a destination: either a noun in the dative, or an adverb like (span @hittite) katta “down” ( on the ground ) .</w:t>
-      </w:r>
-    </w:p>
-    <w:p>
-      <w:pPr>
-        <w:pStyle w:val="BodyText"/>
-        <w:rPr>
-          <w:rFonts w:ascii="DejaVu Sans" w:hAnsi="DejaVu Sans"/>
-        </w:rPr>
-      </w:pPr>
-      <w:bookmarkStart w:id="10" w:name="taking-dropping-putting"/>
-      <w:r>
-        <w:rPr>
-          <w:rFonts w:ascii="DejaVu Sans" w:hAnsi="DejaVu Sans"/>
-        </w:rPr>
-        <w:t>Those last two seemed easier to express in English than Hittite, so the fictional editor of these tablets just comments on the sentences being anomalous and moves on.</w:t>
-      </w:r>
-      <w:bookmarkEnd w:id="10"/>
-    </w:p>
-    <w:p>
-      <w:pPr>
-        <w:pStyle w:val="Heading2"/>
-        <w:rPr>
-          <w:rFonts w:ascii="DejaVu Sans" w:hAnsi="DejaVu Sans"/>
-        </w:rPr>
-      </w:pPr>
-      <w:bookmarkStart w:id="11" w:name="other-actions"/>
-      <w:r>
-        <w:rPr>
-          <w:rFonts w:ascii="DejaVu Sans" w:hAnsi="DejaVu Sans"/>
-        </w:rPr>
-        <w:t>Other actions</w:t>
-      </w:r>
-    </w:p>
-    <w:p>
-      <w:pPr>
-        <w:pStyle w:val="FirstParagraph"/>
-        <w:rPr>
-          <w:rFonts w:ascii="DejaVu Sans" w:hAnsi="DejaVu Sans"/>
-        </w:rPr>
-      </w:pPr>
-      <w:r>
-        <w:rPr>
-          <w:rFonts w:ascii="DejaVu Sans" w:hAnsi="DejaVu Sans"/>
-        </w:rPr>
-        <w:t>Tried to slay without =kan:</w:t>
-      </w:r>
-    </w:p>
-    <w:p>
-      <w:pPr>
-        <w:pStyle w:val="BodyText"/>
-        <w:rPr>
-          <w:rFonts w:ascii="DejaVu Sans" w:hAnsi="DejaVu Sans"/>
-        </w:rPr>
-      </w:pPr>
-      <w:r>
-        <w:rPr>
-          <w:rFonts w:ascii="DejaVu Sans" w:hAnsi="DejaVu Sans"/>
-          <w:i/>
-          <w:iCs/>
-        </w:rPr>
-        <w:t>This sentence is likely a scribal error. The verb (span @hittite) kuenun “slay” requires the sentence particle =kan to be attached to the first word of the sentence.</w:t>
-      </w:r>
-    </w:p>
-    <w:p>
-      <w:pPr>
-        <w:pStyle w:val="BodyText"/>
-        <w:rPr>
-          <w:rFonts w:ascii="DejaVu Sans" w:hAnsi="DejaVu Sans"/>
-        </w:rPr>
-      </w:pPr>
-      <w:r>
-        <w:rPr>
-          <w:rFonts w:ascii="DejaVu Sans" w:hAnsi="DejaVu Sans"/>
-        </w:rPr>
-        <w:t>Tried to slay something that is not alive:</w:t>
-      </w:r>
-    </w:p>
-    <w:p>
-      <w:pPr>
-        <w:pStyle w:val="BodyText"/>
-        <w:rPr>
-          <w:rFonts w:ascii="DejaVu Sans" w:hAnsi="DejaVu Sans"/>
-        </w:rPr>
-      </w:pPr>
-      <w:r>
-        <w:rPr>
-          <w:rFonts w:ascii="DejaVu Sans" w:hAnsi="DejaVu Sans"/>
-        </w:rPr>
-        <w:t>N=aš antuḫšaš natta ēšta.</w:t>
-        <w:br/>
-        <w:t>N=at antuḫšaš natta ēšta.</w:t>
-        <w:br/>
-        <w:t>“It was not a person.”</w:t>
-      </w:r>
-    </w:p>
-    <w:p>
-      <w:pPr>
-        <w:pStyle w:val="BodyText"/>
-        <w:rPr>
-          <w:rFonts w:ascii="DejaVu Sans" w:hAnsi="DejaVu Sans"/>
-        </w:rPr>
-      </w:pPr>
-      <w:r>
-        <w:rPr>
-          <w:rFonts w:ascii="DejaVu Sans" w:hAnsi="DejaVu Sans"/>
-        </w:rPr>
-        <w:t>Tried to slay while not holding the specified weapon:</w:t>
-      </w:r>
-    </w:p>
-    <w:p>
-      <w:pPr>
-        <w:pStyle w:val="BodyText"/>
-        <w:rPr>
-          <w:rFonts w:ascii="DejaVu Sans" w:hAnsi="DejaVu Sans"/>
-        </w:rPr>
-      </w:pPr>
-      <w:bookmarkStart w:id="12" w:name="sentences-describing-basic-actions"/>
-      <w:bookmarkStart w:id="13" w:name="other-actions"/>
-      <w:r>
-        <w:rPr>
-          <w:rFonts w:ascii="DejaVu Sans" w:hAnsi="DejaVu Sans"/>
-        </w:rPr>
-        <w:t>Nu WEAPON-ACC natta ḫarkun.</w:t>
-      </w:r>
-      <w:bookmarkEnd w:id="12"/>
-      <w:bookmarkEnd w:id="13"/>
-    </w:p>
-    <w:p>
-      <w:pPr>
-        <w:pStyle w:val="Heading1"/>
-        <w:rPr>
-          <w:rFonts w:ascii="DejaVu Sans" w:hAnsi="DejaVu Sans"/>
-        </w:rPr>
-      </w:pPr>
-      <w:bookmarkStart w:id="14" w:name="sentences-describing-specific-situations"/>
-      <w:r>
-        <w:rPr>
-          <w:rFonts w:ascii="DejaVu Sans" w:hAnsi="DejaVu Sans"/>
-        </w:rPr>
-        <w:t>Sentences describing specific situations</w:t>
-      </w:r>
-    </w:p>
-    <w:p>
-      <w:pPr>
-        <w:pStyle w:val="FirstParagraph"/>
-        <w:rPr>
-          <w:rFonts w:ascii="DejaVu Sans" w:hAnsi="DejaVu Sans"/>
-        </w:rPr>
-      </w:pPr>
-      <w:r>
-        <w:rPr>
-          <w:rFonts w:ascii="DejaVu Sans" w:hAnsi="DejaVu Sans"/>
-        </w:rPr>
-        <w:t>Filling a vessel with water:</w:t>
-      </w:r>
-    </w:p>
-    <w:p>
-      <w:pPr>
-        <w:pStyle w:val="BodyText"/>
-        <w:rPr>
-          <w:rFonts w:ascii="DejaVu Sans" w:hAnsi="DejaVu Sans"/>
-        </w:rPr>
-      </w:pPr>
-      <w:r>
-        <w:rPr>
-          <w:rFonts w:ascii="DejaVu Sans" w:hAnsi="DejaVu Sans"/>
-        </w:rPr>
-        <w:t>Nu wātar VESSEL-DAT tēḫḫun.</w:t>
-        <w:br/>
-        <w:t>“I put the water in the VESSEL.”</w:t>
-      </w:r>
-    </w:p>
-    <w:p>
-      <w:pPr>
-        <w:pStyle w:val="BodyText"/>
-        <w:rPr>
-          <w:rFonts w:ascii="DejaVu Sans" w:hAnsi="DejaVu Sans"/>
-        </w:rPr>
-      </w:pPr>
-      <w:r>
-        <w:rPr>
-          <w:rFonts w:ascii="DejaVu Sans" w:hAnsi="DejaVu Sans"/>
-        </w:rPr>
-        <w:t>Trying to take water without having a vessel:</w:t>
-      </w:r>
-    </w:p>
-    <w:p>
-      <w:pPr>
-        <w:pStyle w:val="BodyText"/>
-        <w:rPr>
-          <w:rFonts w:ascii="DejaVu Sans" w:hAnsi="DejaVu Sans"/>
-        </w:rPr>
-      </w:pPr>
-      <w:r>
-        <w:rPr>
-          <w:rFonts w:ascii="DejaVu Sans" w:hAnsi="DejaVu Sans"/>
-        </w:rPr>
-        <w:t>Nu wātar natta taruḫḫun ḫarkun.</w:t>
-        <w:br/>
-        <w:t>“I could not hold the water.”</w:t>
-      </w:r>
-    </w:p>
-    <w:p>
-      <w:pPr>
-        <w:pStyle w:val="BodyText"/>
-        <w:rPr>
-          <w:rFonts w:ascii="DejaVu Sans" w:hAnsi="DejaVu Sans"/>
-        </w:rPr>
-      </w:pPr>
-      <w:r>
-        <w:rPr>
-          <w:rFonts w:ascii="DejaVu Sans" w:hAnsi="DejaVu Sans"/>
-        </w:rPr>
-        <w:t>Trying to enter a window that’s out of reach:</w:t>
-      </w:r>
-    </w:p>
-    <w:p>
-      <w:pPr>
-        <w:pStyle w:val="BodyText"/>
-        <w:rPr>
-          <w:rFonts w:ascii="DejaVu Sans" w:hAnsi="DejaVu Sans"/>
-        </w:rPr>
-      </w:pPr>
-      <w:r>
-        <w:rPr>
-          <w:rFonts w:ascii="DejaVu Sans" w:hAnsi="DejaVu Sans"/>
-        </w:rPr>
-        <w:t>N=at parku ēšta.</w:t>
-        <w:br/>
-        <w:t>“It was high up.”</w:t>
-        <w:br/>
-        <w:t xml:space="preserve">(Neuter to agree with </w:t>
-      </w:r>
-      <w:r>
-        <w:rPr>
-          <w:rFonts w:ascii="DejaVu Sans" w:hAnsi="DejaVu Sans"/>
-          <w:i/>
-          <w:iCs/>
-        </w:rPr>
         <w:t>luttāi</w:t>
       </w:r>
       <w:r>
@@ -1727,7 +1675,7 @@
           <w:rFonts w:ascii="DejaVu Sans" w:hAnsi="DejaVu Sans"/>
         </w:rPr>
       </w:pPr>
-      <w:bookmarkStart w:id="15" w:name="sentences-describing-specific-situations"/>
+      <w:bookmarkStart w:id="7" w:name="sentences-describing-specific-situations"/>
       <w:r>
         <w:rPr>
           <w:rFonts w:ascii="DejaVu Sans" w:hAnsi="DejaVu Sans"/>
@@ -1736,7 +1684,7 @@
         <w:br/>
         <w:t>“I was ritually impure. I did not have water.”</w:t>
       </w:r>
-      <w:bookmarkEnd w:id="15"/>
+      <w:bookmarkEnd w:id="7"/>
     </w:p>
     <w:sectPr>
       <w:type w:val="nextPage"/>
@@ -1774,6 +1722,7 @@
     <w:qFormat/>
     <w:pPr>
       <w:widowControl/>
+      <w:suppressAutoHyphens w:val="true"/>
       <w:bidi w:val="0"/>
       <w:spacing w:before="0" w:after="200"/>
       <w:jc w:val="left"/>
@@ -2005,7 +1954,6 @@
   </w:style>
   <w:style w:type="character" w:styleId="FootnoteCharacters">
     <w:name w:val="Footnote Characters"/>
-    <w:basedOn w:val="BodyTextChar"/>
     <w:qFormat/>
     <w:rPr>
       <w:vertAlign w:val="superscript"/>
@@ -2398,6 +2346,7 @@
       <w:keepNext w:val="true"/>
       <w:keepLines/>
       <w:widowControl/>
+      <w:suppressAutoHyphens w:val="true"/>
       <w:bidi w:val="0"/>
       <w:spacing w:before="0" w:after="200"/>
       <w:jc w:val="center"/>
@@ -2419,6 +2368,7 @@
       <w:keepNext w:val="true"/>
       <w:keepLines/>
       <w:widowControl/>
+      <w:suppressAutoHyphens w:val="true"/>
       <w:bidi w:val="0"/>
       <w:spacing w:before="0" w:after="200"/>
       <w:jc w:val="center"/>

</xml_diff>

<commit_message>
adjust sentences and start integrating dgt for testing
</commit_message>
<xml_diff>
--- a/sentences.docx
+++ b/sentences.docx
@@ -686,9 +686,33 @@
         <w:rPr>
           <w:rFonts w:ascii="DejaVu Sans" w:hAnsi="DejaVu Sans"/>
         </w:rPr>
-        <w:t>Nu OBJECTS-NOM HOLDER-DAT PREVERB ēšta.</w:t>
-        <w:br/>
-        <w:t>Nu OBJECTS-NOM HOLDER-DAT PREVERB ešer.</w:t>
+        <w:t>Nu</w:t>
+      </w:r>
+      <w:r>
+        <w:rPr>
+          <w:rFonts w:ascii="DejaVu Sans" w:hAnsi="DejaVu Sans"/>
+        </w:rPr>
+        <w:t>(=kan)</w:t>
+      </w:r>
+      <w:r>
+        <w:rPr>
+          <w:rFonts w:ascii="DejaVu Sans" w:hAnsi="DejaVu Sans"/>
+        </w:rPr>
+        <w:t xml:space="preserve"> OBJECTS-NOM HOLDER-DAT PREVERB ēšta.</w:t>
+        <w:br/>
+        <w:t>Nu</w:t>
+      </w:r>
+      <w:r>
+        <w:rPr>
+          <w:rFonts w:ascii="DejaVu Sans" w:hAnsi="DejaVu Sans"/>
+        </w:rPr>
+        <w:t>(=kan)</w:t>
+      </w:r>
+      <w:r>
+        <w:rPr>
+          <w:rFonts w:ascii="DejaVu Sans" w:hAnsi="DejaVu Sans"/>
+        </w:rPr>
+        <w:t xml:space="preserve"> OBJECTS-NOM HOLDER-DAT PREVERB ešer.</w:t>
         <w:br/>
         <w:t>“OBJECTS were in/on/at HOLDER.”</w:t>
       </w:r>
@@ -1526,7 +1550,7 @@
         <w:rPr>
           <w:rFonts w:ascii="DejaVu Sans" w:hAnsi="DejaVu Sans"/>
         </w:rPr>
-        <w:t>Nu paḫḫur änza ēšta.</w:t>
+        <w:t>Nu paḫḫur än ēšta.</w:t>
         <w:br/>
         <w:t>“The fire was hot.”</w:t>
         <w:br/>
@@ -1558,7 +1582,19 @@
         <w:rPr>
           <w:rFonts w:ascii="DejaVu Sans" w:hAnsi="DejaVu Sans"/>
         </w:rPr>
-        <w:t>Nu wātar paḫḫeni tēḫḫun. N=at kištanunun.</w:t>
+        <w:t>Nu wātar paḫḫ</w:t>
+      </w:r>
+      <w:r>
+        <w:rPr>
+          <w:rFonts w:ascii="DejaVu Sans" w:hAnsi="DejaVu Sans"/>
+        </w:rPr>
+        <w:t>u</w:t>
+      </w:r>
+      <w:r>
+        <w:rPr>
+          <w:rFonts w:ascii="DejaVu Sans" w:hAnsi="DejaVu Sans"/>
+        </w:rPr>
+        <w:t>eni tēḫḫun. N=at kištanunun.</w:t>
         <w:br/>
         <w:t>“I put water on the fire. I extinguished it.”</w:t>
       </w:r>
@@ -1588,7 +1624,19 @@
         <w:rPr>
           <w:rFonts w:ascii="DejaVu Sans" w:hAnsi="DejaVu Sans"/>
         </w:rPr>
-        <w:t>Nu šuḫḫa parku ēšta.</w:t>
+        <w:t>Nu šuḫḫa</w:t>
+      </w:r>
+      <w:r>
+        <w:rPr>
+          <w:rFonts w:ascii="DejaVu Sans" w:hAnsi="DejaVu Sans"/>
+        </w:rPr>
+        <w:t>n</w:t>
+      </w:r>
+      <w:r>
+        <w:rPr>
+          <w:rFonts w:ascii="DejaVu Sans" w:hAnsi="DejaVu Sans"/>
+        </w:rPr>
+        <w:t xml:space="preserve"> parku ēšta.</w:t>
         <w:br/>
         <w:t>“The roof was high up.”</w:t>
       </w:r>

</xml_diff>